<commit_message>
Validate generated showcase DOCX
</commit_message>
<xml_diff>
--- a/apps/demo/public/fixtures/showcase.docx
+++ b/apps/demo/public/fixtures/showcase.docx
@@ -560,10 +560,10 @@
   <w:docDefaults>
     <w:rPrDefault>
       <w:rPr>
+        <w:rFonts w:ascii="Calibri" w:cs="Calibri" w:eastAsia="Calibri" w:hAnsi="Calibri"/>
         <w:color w:val="243447"/>
         <w:sz w:val="20"/>
         <w:szCs w:val="20"/>
-        <w:rFonts w:ascii="Calibri" w:cs="Calibri" w:eastAsia="Calibri" w:hAnsi="Calibri"/>
       </w:rPr>
     </w:rPrDefault>
     <w:pPrDefault/>
@@ -661,8 +661,8 @@
     <w:uiPriority w:val="99"/>
     <w:unhideWhenUsed/>
     <w:rPr>
+      <w:color w:val="0563C1"/>
       <w:u w:val="single"/>
-      <w:color w:val="0563C1"/>
     </w:rPr>
   </w:style>
   <w:style w:type="character" w:styleId="FootnoteReference">
@@ -711,12 +711,12 @@
       <w:spacing w:after="100"/>
     </w:pPr>
     <w:rPr>
+      <w:rFonts w:ascii="Calibri Light" w:cs="Calibri Light" w:eastAsia="Calibri Light" w:hAnsi="Calibri Light"/>
       <w:b/>
       <w:bCs/>
       <w:color w:val="17365D"/>
       <w:sz w:val="42"/>
       <w:szCs w:val="42"/>
-      <w:rFonts w:ascii="Calibri Light" w:cs="Calibri Light" w:eastAsia="Calibri Light" w:hAnsi="Calibri Light"/>
     </w:rPr>
   </w:style>
   <w:style w:type="paragraph" w:styleId="ShowcaseHeading">
@@ -728,12 +728,12 @@
       <w:spacing w:before="130" w:after="70"/>
     </w:pPr>
     <w:rPr>
+      <w:rFonts w:ascii="Calibri" w:cs="Calibri" w:eastAsia="Calibri" w:hAnsi="Calibri"/>
       <w:b/>
       <w:bCs/>
       <w:color w:val="2F5597"/>
       <w:sz w:val="26"/>
       <w:szCs w:val="26"/>
-      <w:rFonts w:ascii="Calibri" w:cs="Calibri" w:eastAsia="Calibri" w:hAnsi="Calibri"/>
     </w:rPr>
   </w:style>
 </w:styles>

</xml_diff>

<commit_message>
Update demo to wordinweb 0.1.6 and tone down showcase copy
0.1.6 preserves the nth-root degree through the linear equation editor
(√[3]{x+1}, editable as plain text) and joins the radical sign to its
vinculum by measuring the painted glyph's ink. Showcase copy reads
matter-of-fact now, the closing pitch line is gone, and .env is
ignored.
</commit_message>
<xml_diff>
--- a/apps/demo/public/fixtures/showcase.docx
+++ b/apps/demo/public/fixtures/showcase.docx
@@ -7,7 +7,7 @@
         <w:pStyle w:val="ShowcaseTitle"/>
       </w:pPr>
       <w:r>
-        <w:t xml:space="preserve">Scientific document, rendered in JavaScript</w:t>
+        <w:t xml:space="preserve">Sample scientific document</w:t>
       </w:r>
     </w:p>
     <w:p>
@@ -19,7 +19,7 @@
           <w:sz w:val="22"/>
           <w:szCs w:val="22"/>
         </w:rPr>
-        <w:t xml:space="preserve">Editable DOCX with native Office Math, tables, images, styles, and pagination.  </w:t>
+        <w:t xml:space="preserve">This file uses native Office Math, tables, images, styles, and pagination.  </w:t>
       </w:r>
       <w:r>
         <w:rPr>
@@ -29,7 +29,7 @@
           <w:sz w:val="22"/>
           <w:szCs w:val="22"/>
         </w:rPr>
-        <w:t xml:space="preserve">Click anywhere and start typing.</w:t>
+        <w:t xml:space="preserve">Click anywhere to edit.</w:t>
       </w:r>
     </w:p>
     <w:p>
@@ -157,7 +157,7 @@
         <w:pStyle w:val="ShowcaseHeading"/>
       </w:pPr>
       <w:r>
-        <w:t xml:space="preserve">Equations inside a real Word table</w:t>
+        <w:t xml:space="preserve">Equations in table cells</w:t>
       </w:r>
     </w:p>
     <w:tbl>
@@ -384,19 +384,6 @@
         </w:tc>
       </w:tr>
     </w:tbl>
-    <w:p>
-      <w:pPr>
-        <w:spacing w:before="120"/>
-      </w:pPr>
-      <w:r>
-        <w:rPr>
-          <w:color w:val="40566F"/>
-          <w:sz w:val="19"/>
-          <w:szCs w:val="19"/>
-        </w:rPr>
-        <w:t xml:space="preserve">Everything on this page remains editable and downloads as a DOCX—no PDF conversion and no server-side rendering.</w:t>
-      </w:r>
-    </w:p>
     <w:sectPr>
       <w:footerReference w:type="default" r:id="rId6"/>
       <w:pgSz w:w="11906" w:h="16838" w:orient="portrait"/>

</xml_diff>